<commit_message>
fix(lb-cb): make it obvious where the answer goes on the signs task and the form
The signs task read as a broken table: five meanings sat in a column beside
three signs, two rows of it empty, and the place to write was a single
underscore tucked after the sign. Nothing said which column was the question and
which was the answer.

It is now two things instead of one. The five meanings sit in a grey panel, as a
list to read. Below it, a small table with one column for the sign and one
headed "Write the letter", with tall empty cells that look like somewhere to
write. Same treatment for the registration form, where the answer column is now
the wide one and the rows are tall enough to write in.

Both papers, and the mark schemes re-checked against them: 16 tasks each,
Reading /36 and Writing /20, no mismatches.

Co-Authored-By: Claude Opus 5 <noreply@anthropic.com>
</commit_message>
<xml_diff>
--- a/public/downloads/cb-en-check-baseline.docx
+++ b/public/downloads/cb-en-check-baseline.docx
@@ -957,7 +957,7 @@
           <w:sz w:val="24"/>
           <w:szCs w:val="24"/>
         </w:rPr>
-        <w:t xml:space="preserve">Write the letter of the correct meaning next to each sign. There are two meanings you will not use.</w:t>
+        <w:t xml:space="preserve">Read the five meanings. Then write the letter of the right meaning beside each sign. You will not use two of them.</w:t>
       </w:r>
     </w:p>
     <w:tbl>
@@ -973,23 +973,129 @@
         </w:tblBorders>
       </w:tblPr>
       <w:tblGrid>
-        <w:gridCol w:w="4535"/>
-        <w:gridCol w:w="4535"/>
+        <w:gridCol w:w="9070"/>
       </w:tblGrid>
       <w:tr>
         <w:tc>
           <w:tcPr>
-            <w:tcW w:type="dxa" w:w="4535"/>
-            <w:tcMar>
-              <w:top w:type="dxa" w:w="70"/>
-              <w:left w:type="dxa" w:w="120"/>
-              <w:bottom w:type="dxa" w:w="70"/>
-              <w:right w:type="dxa" w:w="120"/>
-            </w:tcMar>
-          </w:tcPr>
-          <w:p>
-            <w:pPr>
-              <w:spacing w:line="260"/>
+            <w:tcW w:type="dxa" w:w="9070"/>
+            <w:shd w:fill="EDEBE6"/>
+            <w:tcMar>
+              <w:top w:type="dxa" w:w="200"/>
+              <w:left w:type="dxa" w:w="240"/>
+              <w:bottom w:type="dxa" w:w="200"/>
+              <w:right w:type="dxa" w:w="220"/>
+            </w:tcMar>
+          </w:tcPr>
+          <w:p>
+            <w:pPr>
+              <w:spacing w:after="150" w:before="0" w:line="340"/>
+            </w:pPr>
+            <w:r>
+              <w:rPr>
+                <w:sz w:val="24"/>
+                <w:szCs w:val="24"/>
+              </w:rPr>
+              <w:t xml:space="preserve">A. You can get water here.</w:t>
+            </w:r>
+          </w:p>
+          <w:p>
+            <w:pPr>
+              <w:spacing w:after="150" w:before="0" w:line="340"/>
+            </w:pPr>
+            <w:r>
+              <w:rPr>
+                <w:sz w:val="24"/>
+                <w:szCs w:val="24"/>
+              </w:rPr>
+              <w:t xml:space="preserve">B. Do not go in.</w:t>
+            </w:r>
+          </w:p>
+          <w:p>
+            <w:pPr>
+              <w:spacing w:after="150" w:before="0" w:line="340"/>
+            </w:pPr>
+            <w:r>
+              <w:rPr>
+                <w:sz w:val="24"/>
+                <w:szCs w:val="24"/>
+              </w:rPr>
+              <w:t xml:space="preserve">C. This place is open in the day.</w:t>
+            </w:r>
+          </w:p>
+          <w:p>
+            <w:pPr>
+              <w:spacing w:after="150" w:before="0" w:line="340"/>
+            </w:pPr>
+            <w:r>
+              <w:rPr>
+                <w:sz w:val="24"/>
+                <w:szCs w:val="24"/>
+              </w:rPr>
+              <w:t xml:space="preserve">D. Wash your hands.</w:t>
+            </w:r>
+          </w:p>
+          <w:p>
+            <w:pPr>
+              <w:spacing w:after="0" w:before="0" w:line="340"/>
+            </w:pPr>
+            <w:r>
+              <w:rPr>
+                <w:sz w:val="24"/>
+                <w:szCs w:val="24"/>
+              </w:rPr>
+              <w:t xml:space="preserve">E. Wait outside.</w:t>
+            </w:r>
+          </w:p>
+        </w:tc>
+      </w:tr>
+    </w:tbl>
+    <w:p>
+      <w:pPr>
+        <w:spacing w:after="160" w:before="0" w:line="300"/>
+      </w:pPr>
+      <w:r>
+        <w:rPr>
+          <w:sz w:val="22"/>
+          <w:szCs w:val="22"/>
+        </w:rPr>
+        <w:t xml:space="preserve"/>
+      </w:r>
+    </w:p>
+    <w:tbl>
+      <w:tblPr>
+        <w:tblW w:type="pct" w:w="100%"/>
+        <w:tblBorders>
+          <w:top w:val="single" w:color="B9B3A6" w:sz="2"/>
+          <w:left w:val="single" w:color="B9B3A6" w:sz="2"/>
+          <w:bottom w:val="single" w:color="B9B3A6" w:sz="2"/>
+          <w:right w:val="single" w:color="B9B3A6" w:sz="2"/>
+          <w:insideH w:val="single" w:color="B9B3A6" w:sz="2"/>
+          <w:insideV w:val="single" w:color="B9B3A6" w:sz="2"/>
+        </w:tblBorders>
+      </w:tblPr>
+      <w:tblGrid>
+        <w:gridCol w:w="6712"/>
+        <w:gridCol w:w="2358"/>
+      </w:tblGrid>
+      <w:tr>
+        <w:trPr>
+          <w:trHeight w:val="400" w:hRule="atLeast"/>
+        </w:trPr>
+        <w:tc>
+          <w:tcPr>
+            <w:tcW w:type="dxa" w:w="6712"/>
+            <w:tcMar>
+              <w:top w:type="dxa" w:w="110"/>
+              <w:left w:type="dxa" w:w="160"/>
+              <w:bottom w:type="dxa" w:w="110"/>
+              <w:right w:type="dxa" w:w="160"/>
+            </w:tcMar>
+            <w:vAlign w:val="center"/>
+          </w:tcPr>
+          <w:p>
+            <w:pPr>
+              <w:spacing w:line="300"/>
             </w:pPr>
             <w:r>
               <w:rPr>
@@ -1005,17 +1111,18 @@
         </w:tc>
         <w:tc>
           <w:tcPr>
-            <w:tcW w:type="dxa" w:w="4535"/>
-            <w:tcMar>
-              <w:top w:type="dxa" w:w="70"/>
-              <w:left w:type="dxa" w:w="120"/>
-              <w:bottom w:type="dxa" w:w="70"/>
-              <w:right w:type="dxa" w:w="120"/>
-            </w:tcMar>
-          </w:tcPr>
-          <w:p>
-            <w:pPr>
-              <w:spacing w:line="260"/>
+            <w:tcW w:type="dxa" w:w="2358"/>
+            <w:tcMar>
+              <w:top w:type="dxa" w:w="110"/>
+              <w:left w:type="dxa" w:w="160"/>
+              <w:bottom w:type="dxa" w:w="110"/>
+              <w:right w:type="dxa" w:w="160"/>
+            </w:tcMar>
+            <w:vAlign w:val="center"/>
+          </w:tcPr>
+          <w:p>
+            <w:pPr>
+              <w:spacing w:line="300"/>
             </w:pPr>
             <w:r>
               <w:rPr>
@@ -1025,272 +1132,195 @@
                 <w:sz w:val="19"/>
                 <w:szCs w:val="19"/>
               </w:rPr>
-              <w:t xml:space="preserve">Meaning</w:t>
-            </w:r>
-          </w:p>
-        </w:tc>
-      </w:tr>
-      <w:tr>
-        <w:tc>
-          <w:tcPr>
-            <w:tcW w:type="dxa" w:w="4535"/>
-            <w:tcMar>
-              <w:top w:type="dxa" w:w="70"/>
-              <w:left w:type="dxa" w:w="120"/>
-              <w:bottom w:type="dxa" w:w="70"/>
-              <w:right w:type="dxa" w:w="120"/>
-            </w:tcMar>
-          </w:tcPr>
-          <w:p>
-            <w:pPr>
-              <w:spacing w:line="260"/>
-            </w:pPr>
-            <w:r>
-              <w:rPr>
-                <w:b w:val="false"/>
-                <w:bCs w:val="false"/>
-                <w:sz w:val="19"/>
-                <w:szCs w:val="19"/>
-              </w:rPr>
-              <w:t xml:space="preserve">1. OPEN 9 – 4 _</w:t>
-            </w:r>
-          </w:p>
-        </w:tc>
-        <w:tc>
-          <w:tcPr>
-            <w:tcW w:type="dxa" w:w="4535"/>
-            <w:tcMar>
-              <w:top w:type="dxa" w:w="70"/>
-              <w:left w:type="dxa" w:w="120"/>
-              <w:bottom w:type="dxa" w:w="70"/>
-              <w:right w:type="dxa" w:w="120"/>
-            </w:tcMar>
-          </w:tcPr>
-          <w:p>
-            <w:pPr>
-              <w:spacing w:line="260"/>
-            </w:pPr>
-            <w:r>
-              <w:rPr>
-                <w:b w:val="false"/>
-                <w:bCs w:val="false"/>
-                <w:sz w:val="19"/>
-                <w:szCs w:val="19"/>
-              </w:rPr>
-              <w:t xml:space="preserve">A. You can get water here.</w:t>
-            </w:r>
-          </w:p>
-        </w:tc>
-      </w:tr>
-      <w:tr>
-        <w:tc>
-          <w:tcPr>
-            <w:tcW w:type="dxa" w:w="4535"/>
-            <w:tcMar>
-              <w:top w:type="dxa" w:w="70"/>
-              <w:left w:type="dxa" w:w="120"/>
-              <w:bottom w:type="dxa" w:w="70"/>
-              <w:right w:type="dxa" w:w="120"/>
-            </w:tcMar>
-          </w:tcPr>
-          <w:p>
-            <w:pPr>
-              <w:spacing w:line="260"/>
-            </w:pPr>
-            <w:r>
-              <w:rPr>
-                <w:b w:val="false"/>
-                <w:bCs w:val="false"/>
-                <w:sz w:val="19"/>
-                <w:szCs w:val="19"/>
-              </w:rPr>
-              <w:t xml:space="preserve">2. NO ENTRY _</w:t>
-            </w:r>
-          </w:p>
-        </w:tc>
-        <w:tc>
-          <w:tcPr>
-            <w:tcW w:type="dxa" w:w="4535"/>
-            <w:tcMar>
-              <w:top w:type="dxa" w:w="70"/>
-              <w:left w:type="dxa" w:w="120"/>
-              <w:bottom w:type="dxa" w:w="70"/>
-              <w:right w:type="dxa" w:w="120"/>
-            </w:tcMar>
-          </w:tcPr>
-          <w:p>
-            <w:pPr>
-              <w:spacing w:line="260"/>
-            </w:pPr>
-            <w:r>
-              <w:rPr>
-                <w:b w:val="false"/>
-                <w:bCs w:val="false"/>
-                <w:sz w:val="19"/>
-                <w:szCs w:val="19"/>
-              </w:rPr>
-              <w:t xml:space="preserve">B. Do not go in.</w:t>
-            </w:r>
-          </w:p>
-        </w:tc>
-      </w:tr>
-      <w:tr>
-        <w:tc>
-          <w:tcPr>
-            <w:tcW w:type="dxa" w:w="4535"/>
-            <w:tcMar>
-              <w:top w:type="dxa" w:w="70"/>
-              <w:left w:type="dxa" w:w="120"/>
-              <w:bottom w:type="dxa" w:w="70"/>
-              <w:right w:type="dxa" w:w="120"/>
-            </w:tcMar>
-          </w:tcPr>
-          <w:p>
-            <w:pPr>
-              <w:spacing w:line="260"/>
-            </w:pPr>
-            <w:r>
-              <w:rPr>
-                <w:b w:val="false"/>
-                <w:bCs w:val="false"/>
-                <w:sz w:val="19"/>
-                <w:szCs w:val="19"/>
-              </w:rPr>
-              <w:t xml:space="preserve">3. WATER HERE _</w:t>
-            </w:r>
-          </w:p>
-        </w:tc>
-        <w:tc>
-          <w:tcPr>
-            <w:tcW w:type="dxa" w:w="4535"/>
-            <w:tcMar>
-              <w:top w:type="dxa" w:w="70"/>
-              <w:left w:type="dxa" w:w="120"/>
-              <w:bottom w:type="dxa" w:w="70"/>
-              <w:right w:type="dxa" w:w="120"/>
-            </w:tcMar>
-          </w:tcPr>
-          <w:p>
-            <w:pPr>
-              <w:spacing w:line="260"/>
-            </w:pPr>
-            <w:r>
-              <w:rPr>
-                <w:b w:val="false"/>
-                <w:bCs w:val="false"/>
-                <w:sz w:val="19"/>
-                <w:szCs w:val="19"/>
-              </w:rPr>
-              <w:t xml:space="preserve">C. This place is open in the day.</w:t>
-            </w:r>
-          </w:p>
-        </w:tc>
-      </w:tr>
-      <w:tr>
-        <w:tc>
-          <w:tcPr>
-            <w:tcW w:type="dxa" w:w="4535"/>
-            <w:tcMar>
-              <w:top w:type="dxa" w:w="70"/>
-              <w:left w:type="dxa" w:w="120"/>
-              <w:bottom w:type="dxa" w:w="70"/>
-              <w:right w:type="dxa" w:w="120"/>
-            </w:tcMar>
-          </w:tcPr>
-          <w:p>
-            <w:pPr>
-              <w:spacing w:line="260"/>
-            </w:pPr>
-            <w:r>
-              <w:rPr>
-                <w:b w:val="false"/>
-                <w:bCs w:val="false"/>
-                <w:sz w:val="19"/>
-                <w:szCs w:val="19"/>
+              <w:t xml:space="preserve">Write the letter</w:t>
+            </w:r>
+          </w:p>
+        </w:tc>
+      </w:tr>
+      <w:tr>
+        <w:trPr>
+          <w:trHeight w:val="640" w:hRule="atLeast"/>
+        </w:trPr>
+        <w:tc>
+          <w:tcPr>
+            <w:tcW w:type="dxa" w:w="6712"/>
+            <w:tcMar>
+              <w:top w:type="dxa" w:w="110"/>
+              <w:left w:type="dxa" w:w="160"/>
+              <w:bottom w:type="dxa" w:w="110"/>
+              <w:right w:type="dxa" w:w="160"/>
+            </w:tcMar>
+            <w:vAlign w:val="center"/>
+          </w:tcPr>
+          <w:p>
+            <w:pPr>
+              <w:spacing w:line="300"/>
+            </w:pPr>
+            <w:r>
+              <w:rPr>
+                <w:b w:val="false"/>
+                <w:bCs w:val="false"/>
+                <w:sz w:val="24"/>
+                <w:szCs w:val="24"/>
+              </w:rPr>
+              <w:t xml:space="preserve">OPEN 9 – 4</w:t>
+            </w:r>
+          </w:p>
+        </w:tc>
+        <w:tc>
+          <w:tcPr>
+            <w:tcW w:type="dxa" w:w="2358"/>
+            <w:tcMar>
+              <w:top w:type="dxa" w:w="110"/>
+              <w:left w:type="dxa" w:w="160"/>
+              <w:bottom w:type="dxa" w:w="110"/>
+              <w:right w:type="dxa" w:w="160"/>
+            </w:tcMar>
+            <w:vAlign w:val="center"/>
+          </w:tcPr>
+          <w:p>
+            <w:pPr>
+              <w:spacing w:line="300"/>
+            </w:pPr>
+            <w:r>
+              <w:rPr>
+                <w:b w:val="false"/>
+                <w:bCs w:val="false"/>
+                <w:sz w:val="24"/>
+                <w:szCs w:val="24"/>
               </w:rPr>
               <w:t xml:space="preserve"/>
             </w:r>
           </w:p>
         </w:tc>
-        <w:tc>
-          <w:tcPr>
-            <w:tcW w:type="dxa" w:w="4535"/>
-            <w:tcMar>
-              <w:top w:type="dxa" w:w="70"/>
-              <w:left w:type="dxa" w:w="120"/>
-              <w:bottom w:type="dxa" w:w="70"/>
-              <w:right w:type="dxa" w:w="120"/>
-            </w:tcMar>
-          </w:tcPr>
-          <w:p>
-            <w:pPr>
-              <w:spacing w:line="260"/>
-            </w:pPr>
-            <w:r>
-              <w:rPr>
-                <w:b w:val="false"/>
-                <w:bCs w:val="false"/>
-                <w:sz w:val="19"/>
-                <w:szCs w:val="19"/>
-              </w:rPr>
-              <w:t xml:space="preserve">D. Wash your hands.</w:t>
-            </w:r>
-          </w:p>
-        </w:tc>
-      </w:tr>
-      <w:tr>
-        <w:tc>
-          <w:tcPr>
-            <w:tcW w:type="dxa" w:w="4535"/>
-            <w:tcMar>
-              <w:top w:type="dxa" w:w="70"/>
-              <w:left w:type="dxa" w:w="120"/>
-              <w:bottom w:type="dxa" w:w="70"/>
-              <w:right w:type="dxa" w:w="120"/>
-            </w:tcMar>
-          </w:tcPr>
-          <w:p>
-            <w:pPr>
-              <w:spacing w:line="260"/>
-            </w:pPr>
-            <w:r>
-              <w:rPr>
-                <w:b w:val="false"/>
-                <w:bCs w:val="false"/>
-                <w:sz w:val="19"/>
-                <w:szCs w:val="19"/>
+      </w:tr>
+      <w:tr>
+        <w:trPr>
+          <w:trHeight w:val="640" w:hRule="atLeast"/>
+        </w:trPr>
+        <w:tc>
+          <w:tcPr>
+            <w:tcW w:type="dxa" w:w="6712"/>
+            <w:tcMar>
+              <w:top w:type="dxa" w:w="110"/>
+              <w:left w:type="dxa" w:w="160"/>
+              <w:bottom w:type="dxa" w:w="110"/>
+              <w:right w:type="dxa" w:w="160"/>
+            </w:tcMar>
+            <w:vAlign w:val="center"/>
+          </w:tcPr>
+          <w:p>
+            <w:pPr>
+              <w:spacing w:line="300"/>
+            </w:pPr>
+            <w:r>
+              <w:rPr>
+                <w:b w:val="false"/>
+                <w:bCs w:val="false"/>
+                <w:sz w:val="24"/>
+                <w:szCs w:val="24"/>
+              </w:rPr>
+              <w:t xml:space="preserve">NO ENTRY</w:t>
+            </w:r>
+          </w:p>
+        </w:tc>
+        <w:tc>
+          <w:tcPr>
+            <w:tcW w:type="dxa" w:w="2358"/>
+            <w:tcMar>
+              <w:top w:type="dxa" w:w="110"/>
+              <w:left w:type="dxa" w:w="160"/>
+              <w:bottom w:type="dxa" w:w="110"/>
+              <w:right w:type="dxa" w:w="160"/>
+            </w:tcMar>
+            <w:vAlign w:val="center"/>
+          </w:tcPr>
+          <w:p>
+            <w:pPr>
+              <w:spacing w:line="300"/>
+            </w:pPr>
+            <w:r>
+              <w:rPr>
+                <w:b w:val="false"/>
+                <w:bCs w:val="false"/>
+                <w:sz w:val="24"/>
+                <w:szCs w:val="24"/>
               </w:rPr>
               <w:t xml:space="preserve"/>
             </w:r>
           </w:p>
         </w:tc>
-        <w:tc>
-          <w:tcPr>
-            <w:tcW w:type="dxa" w:w="4535"/>
-            <w:tcMar>
-              <w:top w:type="dxa" w:w="70"/>
-              <w:left w:type="dxa" w:w="120"/>
-              <w:bottom w:type="dxa" w:w="70"/>
-              <w:right w:type="dxa" w:w="120"/>
-            </w:tcMar>
-          </w:tcPr>
-          <w:p>
-            <w:pPr>
-              <w:spacing w:line="260"/>
-            </w:pPr>
-            <w:r>
-              <w:rPr>
-                <w:b w:val="false"/>
-                <w:bCs w:val="false"/>
-                <w:sz w:val="19"/>
-                <w:szCs w:val="19"/>
-              </w:rPr>
-              <w:t xml:space="preserve">E. Wait outside.</w:t>
+      </w:tr>
+      <w:tr>
+        <w:trPr>
+          <w:trHeight w:val="640" w:hRule="atLeast"/>
+        </w:trPr>
+        <w:tc>
+          <w:tcPr>
+            <w:tcW w:type="dxa" w:w="6712"/>
+            <w:tcMar>
+              <w:top w:type="dxa" w:w="110"/>
+              <w:left w:type="dxa" w:w="160"/>
+              <w:bottom w:type="dxa" w:w="110"/>
+              <w:right w:type="dxa" w:w="160"/>
+            </w:tcMar>
+            <w:vAlign w:val="center"/>
+          </w:tcPr>
+          <w:p>
+            <w:pPr>
+              <w:spacing w:line="300"/>
+            </w:pPr>
+            <w:r>
+              <w:rPr>
+                <w:b w:val="false"/>
+                <w:bCs w:val="false"/>
+                <w:sz w:val="24"/>
+                <w:szCs w:val="24"/>
+              </w:rPr>
+              <w:t xml:space="preserve">WATER HERE</w:t>
+            </w:r>
+          </w:p>
+        </w:tc>
+        <w:tc>
+          <w:tcPr>
+            <w:tcW w:type="dxa" w:w="2358"/>
+            <w:tcMar>
+              <w:top w:type="dxa" w:w="110"/>
+              <w:left w:type="dxa" w:w="160"/>
+              <w:bottom w:type="dxa" w:w="110"/>
+              <w:right w:type="dxa" w:w="160"/>
+            </w:tcMar>
+            <w:vAlign w:val="center"/>
+          </w:tcPr>
+          <w:p>
+            <w:pPr>
+              <w:spacing w:line="300"/>
+            </w:pPr>
+            <w:r>
+              <w:rPr>
+                <w:b w:val="false"/>
+                <w:bCs w:val="false"/>
+                <w:sz w:val="24"/>
+                <w:szCs w:val="24"/>
+              </w:rPr>
+              <w:t xml:space="preserve"/>
             </w:r>
           </w:p>
         </w:tc>
       </w:tr>
     </w:tbl>
+    <w:p>
+      <w:pPr>
+        <w:spacing w:after="180" w:before="0" w:line="300"/>
+      </w:pPr>
+      <w:r>
+        <w:rPr>
+          <w:sz w:val="22"/>
+          <w:szCs w:val="22"/>
+        </w:rPr>
+        <w:t xml:space="preserve"/>
+      </w:r>
+    </w:p>
     <w:p>
       <w:pPr>
         <w:pStyle w:val="Heading2"/>
@@ -2987,23 +3017,27 @@
         </w:tblBorders>
       </w:tblPr>
       <w:tblGrid>
-        <w:gridCol w:w="4535"/>
-        <w:gridCol w:w="4535"/>
+        <w:gridCol w:w="3447"/>
+        <w:gridCol w:w="5623"/>
       </w:tblGrid>
       <w:tr>
-        <w:tc>
-          <w:tcPr>
-            <w:tcW w:type="dxa" w:w="4535"/>
-            <w:tcMar>
-              <w:top w:type="dxa" w:w="70"/>
-              <w:left w:type="dxa" w:w="120"/>
-              <w:bottom w:type="dxa" w:w="70"/>
-              <w:right w:type="dxa" w:w="120"/>
-            </w:tcMar>
-          </w:tcPr>
-          <w:p>
-            <w:pPr>
-              <w:spacing w:line="260"/>
+        <w:trPr>
+          <w:trHeight w:val="400" w:hRule="atLeast"/>
+        </w:trPr>
+        <w:tc>
+          <w:tcPr>
+            <w:tcW w:type="dxa" w:w="3447"/>
+            <w:tcMar>
+              <w:top w:type="dxa" w:w="110"/>
+              <w:left w:type="dxa" w:w="160"/>
+              <w:bottom w:type="dxa" w:w="110"/>
+              <w:right w:type="dxa" w:w="160"/>
+            </w:tcMar>
+            <w:vAlign w:val="center"/>
+          </w:tcPr>
+          <w:p>
+            <w:pPr>
+              <w:spacing w:line="300"/>
             </w:pPr>
             <w:r>
               <w:rPr>
@@ -3019,17 +3053,18 @@
         </w:tc>
         <w:tc>
           <w:tcPr>
-            <w:tcW w:type="dxa" w:w="4535"/>
-            <w:tcMar>
-              <w:top w:type="dxa" w:w="70"/>
-              <w:left w:type="dxa" w:w="120"/>
-              <w:bottom w:type="dxa" w:w="70"/>
-              <w:right w:type="dxa" w:w="120"/>
-            </w:tcMar>
-          </w:tcPr>
-          <w:p>
-            <w:pPr>
-              <w:spacing w:line="260"/>
+            <w:tcW w:type="dxa" w:w="5623"/>
+            <w:tcMar>
+              <w:top w:type="dxa" w:w="110"/>
+              <w:left w:type="dxa" w:w="160"/>
+              <w:bottom w:type="dxa" w:w="110"/>
+              <w:right w:type="dxa" w:w="160"/>
+            </w:tcMar>
+            <w:vAlign w:val="center"/>
+          </w:tcPr>
+          <w:p>
+            <w:pPr>
+              <w:spacing w:line="300"/>
             </w:pPr>
             <w:r>
               <w:rPr>
@@ -3045,26 +3080,30 @@
         </w:tc>
       </w:tr>
       <w:tr>
-        <w:tc>
-          <w:tcPr>
-            <w:tcW w:type="dxa" w:w="4535"/>
-            <w:tcMar>
-              <w:top w:type="dxa" w:w="70"/>
-              <w:left w:type="dxa" w:w="120"/>
-              <w:bottom w:type="dxa" w:w="70"/>
-              <w:right w:type="dxa" w:w="120"/>
-            </w:tcMar>
-          </w:tcPr>
-          <w:p>
-            <w:pPr>
-              <w:spacing w:line="260"/>
-            </w:pPr>
-            <w:r>
-              <w:rPr>
-                <w:b w:val="false"/>
-                <w:bCs w:val="false"/>
-                <w:sz w:val="19"/>
-                <w:szCs w:val="19"/>
+        <w:trPr>
+          <w:trHeight w:val="640" w:hRule="atLeast"/>
+        </w:trPr>
+        <w:tc>
+          <w:tcPr>
+            <w:tcW w:type="dxa" w:w="3447"/>
+            <w:tcMar>
+              <w:top w:type="dxa" w:w="110"/>
+              <w:left w:type="dxa" w:w="160"/>
+              <w:bottom w:type="dxa" w:w="110"/>
+              <w:right w:type="dxa" w:w="160"/>
+            </w:tcMar>
+            <w:vAlign w:val="center"/>
+          </w:tcPr>
+          <w:p>
+            <w:pPr>
+              <w:spacing w:line="300"/>
+            </w:pPr>
+            <w:r>
+              <w:rPr>
+                <w:b w:val="false"/>
+                <w:bCs w:val="false"/>
+                <w:sz w:val="24"/>
+                <w:szCs w:val="24"/>
               </w:rPr>
               <w:t xml:space="preserve">Age</w:t>
             </w:r>
@@ -3072,24 +3111,25 @@
         </w:tc>
         <w:tc>
           <w:tcPr>
-            <w:tcW w:type="dxa" w:w="4535"/>
-            <w:tcMar>
-              <w:top w:type="dxa" w:w="70"/>
-              <w:left w:type="dxa" w:w="120"/>
-              <w:bottom w:type="dxa" w:w="70"/>
-              <w:right w:type="dxa" w:w="120"/>
-            </w:tcMar>
-          </w:tcPr>
-          <w:p>
-            <w:pPr>
-              <w:spacing w:line="260"/>
-            </w:pPr>
-            <w:r>
-              <w:rPr>
-                <w:b w:val="false"/>
-                <w:bCs w:val="false"/>
-                <w:sz w:val="19"/>
-                <w:szCs w:val="19"/>
+            <w:tcW w:type="dxa" w:w="5623"/>
+            <w:tcMar>
+              <w:top w:type="dxa" w:w="110"/>
+              <w:left w:type="dxa" w:w="160"/>
+              <w:bottom w:type="dxa" w:w="110"/>
+              <w:right w:type="dxa" w:w="160"/>
+            </w:tcMar>
+            <w:vAlign w:val="center"/>
+          </w:tcPr>
+          <w:p>
+            <w:pPr>
+              <w:spacing w:line="300"/>
+            </w:pPr>
+            <w:r>
+              <w:rPr>
+                <w:b w:val="false"/>
+                <w:bCs w:val="false"/>
+                <w:sz w:val="24"/>
+                <w:szCs w:val="24"/>
               </w:rPr>
               <w:t xml:space="preserve"/>
             </w:r>
@@ -3097,26 +3137,30 @@
         </w:tc>
       </w:tr>
       <w:tr>
-        <w:tc>
-          <w:tcPr>
-            <w:tcW w:type="dxa" w:w="4535"/>
-            <w:tcMar>
-              <w:top w:type="dxa" w:w="70"/>
-              <w:left w:type="dxa" w:w="120"/>
-              <w:bottom w:type="dxa" w:w="70"/>
-              <w:right w:type="dxa" w:w="120"/>
-            </w:tcMar>
-          </w:tcPr>
-          <w:p>
-            <w:pPr>
-              <w:spacing w:line="260"/>
-            </w:pPr>
-            <w:r>
-              <w:rPr>
-                <w:b w:val="false"/>
-                <w:bCs w:val="false"/>
-                <w:sz w:val="19"/>
-                <w:szCs w:val="19"/>
+        <w:trPr>
+          <w:trHeight w:val="640" w:hRule="atLeast"/>
+        </w:trPr>
+        <w:tc>
+          <w:tcPr>
+            <w:tcW w:type="dxa" w:w="3447"/>
+            <w:tcMar>
+              <w:top w:type="dxa" w:w="110"/>
+              <w:left w:type="dxa" w:w="160"/>
+              <w:bottom w:type="dxa" w:w="110"/>
+              <w:right w:type="dxa" w:w="160"/>
+            </w:tcMar>
+            <w:vAlign w:val="center"/>
+          </w:tcPr>
+          <w:p>
+            <w:pPr>
+              <w:spacing w:line="300"/>
+            </w:pPr>
+            <w:r>
+              <w:rPr>
+                <w:b w:val="false"/>
+                <w:bCs w:val="false"/>
+                <w:sz w:val="24"/>
+                <w:szCs w:val="24"/>
               </w:rPr>
               <w:t xml:space="preserve">Female / Male</w:t>
             </w:r>
@@ -3124,24 +3168,25 @@
         </w:tc>
         <w:tc>
           <w:tcPr>
-            <w:tcW w:type="dxa" w:w="4535"/>
-            <w:tcMar>
-              <w:top w:type="dxa" w:w="70"/>
-              <w:left w:type="dxa" w:w="120"/>
-              <w:bottom w:type="dxa" w:w="70"/>
-              <w:right w:type="dxa" w:w="120"/>
-            </w:tcMar>
-          </w:tcPr>
-          <w:p>
-            <w:pPr>
-              <w:spacing w:line="260"/>
-            </w:pPr>
-            <w:r>
-              <w:rPr>
-                <w:b w:val="false"/>
-                <w:bCs w:val="false"/>
-                <w:sz w:val="19"/>
-                <w:szCs w:val="19"/>
+            <w:tcW w:type="dxa" w:w="5623"/>
+            <w:tcMar>
+              <w:top w:type="dxa" w:w="110"/>
+              <w:left w:type="dxa" w:w="160"/>
+              <w:bottom w:type="dxa" w:w="110"/>
+              <w:right w:type="dxa" w:w="160"/>
+            </w:tcMar>
+            <w:vAlign w:val="center"/>
+          </w:tcPr>
+          <w:p>
+            <w:pPr>
+              <w:spacing w:line="300"/>
+            </w:pPr>
+            <w:r>
+              <w:rPr>
+                <w:b w:val="false"/>
+                <w:bCs w:val="false"/>
+                <w:sz w:val="24"/>
+                <w:szCs w:val="24"/>
               </w:rPr>
               <w:t xml:space="preserve"/>
             </w:r>
@@ -3149,26 +3194,30 @@
         </w:tc>
       </w:tr>
       <w:tr>
-        <w:tc>
-          <w:tcPr>
-            <w:tcW w:type="dxa" w:w="4535"/>
-            <w:tcMar>
-              <w:top w:type="dxa" w:w="70"/>
-              <w:left w:type="dxa" w:w="120"/>
-              <w:bottom w:type="dxa" w:w="70"/>
-              <w:right w:type="dxa" w:w="120"/>
-            </w:tcMar>
-          </w:tcPr>
-          <w:p>
-            <w:pPr>
-              <w:spacing w:line="260"/>
-            </w:pPr>
-            <w:r>
-              <w:rPr>
-                <w:b w:val="false"/>
-                <w:bCs w:val="false"/>
-                <w:sz w:val="19"/>
-                <w:szCs w:val="19"/>
+        <w:trPr>
+          <w:trHeight w:val="640" w:hRule="atLeast"/>
+        </w:trPr>
+        <w:tc>
+          <w:tcPr>
+            <w:tcW w:type="dxa" w:w="3447"/>
+            <w:tcMar>
+              <w:top w:type="dxa" w:w="110"/>
+              <w:left w:type="dxa" w:w="160"/>
+              <w:bottom w:type="dxa" w:w="110"/>
+              <w:right w:type="dxa" w:w="160"/>
+            </w:tcMar>
+            <w:vAlign w:val="center"/>
+          </w:tcPr>
+          <w:p>
+            <w:pPr>
+              <w:spacing w:line="300"/>
+            </w:pPr>
+            <w:r>
+              <w:rPr>
+                <w:b w:val="false"/>
+                <w:bCs w:val="false"/>
+                <w:sz w:val="24"/>
+                <w:szCs w:val="24"/>
               </w:rPr>
               <w:t xml:space="preserve">Block</w:t>
             </w:r>
@@ -3176,24 +3225,25 @@
         </w:tc>
         <w:tc>
           <w:tcPr>
-            <w:tcW w:type="dxa" w:w="4535"/>
-            <w:tcMar>
-              <w:top w:type="dxa" w:w="70"/>
-              <w:left w:type="dxa" w:w="120"/>
-              <w:bottom w:type="dxa" w:w="70"/>
-              <w:right w:type="dxa" w:w="120"/>
-            </w:tcMar>
-          </w:tcPr>
-          <w:p>
-            <w:pPr>
-              <w:spacing w:line="260"/>
-            </w:pPr>
-            <w:r>
-              <w:rPr>
-                <w:b w:val="false"/>
-                <w:bCs w:val="false"/>
-                <w:sz w:val="19"/>
-                <w:szCs w:val="19"/>
+            <w:tcW w:type="dxa" w:w="5623"/>
+            <w:tcMar>
+              <w:top w:type="dxa" w:w="110"/>
+              <w:left w:type="dxa" w:w="160"/>
+              <w:bottom w:type="dxa" w:w="110"/>
+              <w:right w:type="dxa" w:w="160"/>
+            </w:tcMar>
+            <w:vAlign w:val="center"/>
+          </w:tcPr>
+          <w:p>
+            <w:pPr>
+              <w:spacing w:line="300"/>
+            </w:pPr>
+            <w:r>
+              <w:rPr>
+                <w:b w:val="false"/>
+                <w:bCs w:val="false"/>
+                <w:sz w:val="24"/>
+                <w:szCs w:val="24"/>
               </w:rPr>
               <w:t xml:space="preserve"/>
             </w:r>
@@ -3201,26 +3251,30 @@
         </w:tc>
       </w:tr>
       <w:tr>
-        <w:tc>
-          <w:tcPr>
-            <w:tcW w:type="dxa" w:w="4535"/>
-            <w:tcMar>
-              <w:top w:type="dxa" w:w="70"/>
-              <w:left w:type="dxa" w:w="120"/>
-              <w:bottom w:type="dxa" w:w="70"/>
-              <w:right w:type="dxa" w:w="120"/>
-            </w:tcMar>
-          </w:tcPr>
-          <w:p>
-            <w:pPr>
-              <w:spacing w:line="260"/>
-            </w:pPr>
-            <w:r>
-              <w:rPr>
-                <w:b w:val="false"/>
-                <w:bCs w:val="false"/>
-                <w:sz w:val="19"/>
-                <w:szCs w:val="19"/>
+        <w:trPr>
+          <w:trHeight w:val="640" w:hRule="atLeast"/>
+        </w:trPr>
+        <w:tc>
+          <w:tcPr>
+            <w:tcW w:type="dxa" w:w="3447"/>
+            <w:tcMar>
+              <w:top w:type="dxa" w:w="110"/>
+              <w:left w:type="dxa" w:w="160"/>
+              <w:bottom w:type="dxa" w:w="110"/>
+              <w:right w:type="dxa" w:w="160"/>
+            </w:tcMar>
+            <w:vAlign w:val="center"/>
+          </w:tcPr>
+          <w:p>
+            <w:pPr>
+              <w:spacing w:line="300"/>
+            </w:pPr>
+            <w:r>
+              <w:rPr>
+                <w:b w:val="false"/>
+                <w:bCs w:val="false"/>
+                <w:sz w:val="24"/>
+                <w:szCs w:val="24"/>
               </w:rPr>
               <w:t xml:space="preserve">Learning centre</w:t>
             </w:r>
@@ -3228,24 +3282,25 @@
         </w:tc>
         <w:tc>
           <w:tcPr>
-            <w:tcW w:type="dxa" w:w="4535"/>
-            <w:tcMar>
-              <w:top w:type="dxa" w:w="70"/>
-              <w:left w:type="dxa" w:w="120"/>
-              <w:bottom w:type="dxa" w:w="70"/>
-              <w:right w:type="dxa" w:w="120"/>
-            </w:tcMar>
-          </w:tcPr>
-          <w:p>
-            <w:pPr>
-              <w:spacing w:line="260"/>
-            </w:pPr>
-            <w:r>
-              <w:rPr>
-                <w:b w:val="false"/>
-                <w:bCs w:val="false"/>
-                <w:sz w:val="19"/>
-                <w:szCs w:val="19"/>
+            <w:tcW w:type="dxa" w:w="5623"/>
+            <w:tcMar>
+              <w:top w:type="dxa" w:w="110"/>
+              <w:left w:type="dxa" w:w="160"/>
+              <w:bottom w:type="dxa" w:w="110"/>
+              <w:right w:type="dxa" w:w="160"/>
+            </w:tcMar>
+            <w:vAlign w:val="center"/>
+          </w:tcPr>
+          <w:p>
+            <w:pPr>
+              <w:spacing w:line="300"/>
+            </w:pPr>
+            <w:r>
+              <w:rPr>
+                <w:b w:val="false"/>
+                <w:bCs w:val="false"/>
+                <w:sz w:val="24"/>
+                <w:szCs w:val="24"/>
               </w:rPr>
               <w:t xml:space="preserve"/>
             </w:r>
@@ -3253,26 +3308,30 @@
         </w:tc>
       </w:tr>
       <w:tr>
-        <w:tc>
-          <w:tcPr>
-            <w:tcW w:type="dxa" w:w="4535"/>
-            <w:tcMar>
-              <w:top w:type="dxa" w:w="70"/>
-              <w:left w:type="dxa" w:w="120"/>
-              <w:bottom w:type="dxa" w:w="70"/>
-              <w:right w:type="dxa" w:w="120"/>
-            </w:tcMar>
-          </w:tcPr>
-          <w:p>
-            <w:pPr>
-              <w:spacing w:line="260"/>
-            </w:pPr>
-            <w:r>
-              <w:rPr>
-                <w:b w:val="false"/>
-                <w:bCs w:val="false"/>
-                <w:sz w:val="19"/>
-                <w:szCs w:val="19"/>
+        <w:trPr>
+          <w:trHeight w:val="640" w:hRule="atLeast"/>
+        </w:trPr>
+        <w:tc>
+          <w:tcPr>
+            <w:tcW w:type="dxa" w:w="3447"/>
+            <w:tcMar>
+              <w:top w:type="dxa" w:w="110"/>
+              <w:left w:type="dxa" w:w="160"/>
+              <w:bottom w:type="dxa" w:w="110"/>
+              <w:right w:type="dxa" w:w="160"/>
+            </w:tcMar>
+            <w:vAlign w:val="center"/>
+          </w:tcPr>
+          <w:p>
+            <w:pPr>
+              <w:spacing w:line="300"/>
+            </w:pPr>
+            <w:r>
+              <w:rPr>
+                <w:b w:val="false"/>
+                <w:bCs w:val="false"/>
+                <w:sz w:val="24"/>
+                <w:szCs w:val="24"/>
               </w:rPr>
               <w:t xml:space="preserve">Languages you speak</w:t>
             </w:r>
@@ -3280,24 +3339,25 @@
         </w:tc>
         <w:tc>
           <w:tcPr>
-            <w:tcW w:type="dxa" w:w="4535"/>
-            <w:tcMar>
-              <w:top w:type="dxa" w:w="70"/>
-              <w:left w:type="dxa" w:w="120"/>
-              <w:bottom w:type="dxa" w:w="70"/>
-              <w:right w:type="dxa" w:w="120"/>
-            </w:tcMar>
-          </w:tcPr>
-          <w:p>
-            <w:pPr>
-              <w:spacing w:line="260"/>
-            </w:pPr>
-            <w:r>
-              <w:rPr>
-                <w:b w:val="false"/>
-                <w:bCs w:val="false"/>
-                <w:sz w:val="19"/>
-                <w:szCs w:val="19"/>
+            <w:tcW w:type="dxa" w:w="5623"/>
+            <w:tcMar>
+              <w:top w:type="dxa" w:w="110"/>
+              <w:left w:type="dxa" w:w="160"/>
+              <w:bottom w:type="dxa" w:w="110"/>
+              <w:right w:type="dxa" w:w="160"/>
+            </w:tcMar>
+            <w:vAlign w:val="center"/>
+          </w:tcPr>
+          <w:p>
+            <w:pPr>
+              <w:spacing w:line="300"/>
+            </w:pPr>
+            <w:r>
+              <w:rPr>
+                <w:b w:val="false"/>
+                <w:bCs w:val="false"/>
+                <w:sz w:val="24"/>
+                <w:szCs w:val="24"/>
               </w:rPr>
               <w:t xml:space="preserve"/>
             </w:r>
@@ -3305,26 +3365,30 @@
         </w:tc>
       </w:tr>
       <w:tr>
-        <w:tc>
-          <w:tcPr>
-            <w:tcW w:type="dxa" w:w="4535"/>
-            <w:tcMar>
-              <w:top w:type="dxa" w:w="70"/>
-              <w:left w:type="dxa" w:w="120"/>
-              <w:bottom w:type="dxa" w:w="70"/>
-              <w:right w:type="dxa" w:w="120"/>
-            </w:tcMar>
-          </w:tcPr>
-          <w:p>
-            <w:pPr>
-              <w:spacing w:line="260"/>
-            </w:pPr>
-            <w:r>
-              <w:rPr>
-                <w:b w:val="false"/>
-                <w:bCs w:val="false"/>
-                <w:sz w:val="19"/>
-                <w:szCs w:val="19"/>
+        <w:trPr>
+          <w:trHeight w:val="640" w:hRule="atLeast"/>
+        </w:trPr>
+        <w:tc>
+          <w:tcPr>
+            <w:tcW w:type="dxa" w:w="3447"/>
+            <w:tcMar>
+              <w:top w:type="dxa" w:w="110"/>
+              <w:left w:type="dxa" w:w="160"/>
+              <w:bottom w:type="dxa" w:w="110"/>
+              <w:right w:type="dxa" w:w="160"/>
+            </w:tcMar>
+            <w:vAlign w:val="center"/>
+          </w:tcPr>
+          <w:p>
+            <w:pPr>
+              <w:spacing w:line="300"/>
+            </w:pPr>
+            <w:r>
+              <w:rPr>
+                <w:b w:val="false"/>
+                <w:bCs w:val="false"/>
+                <w:sz w:val="24"/>
+                <w:szCs w:val="24"/>
               </w:rPr>
               <w:t xml:space="preserve">A phone number we can use</w:t>
             </w:r>
@@ -3332,24 +3396,25 @@
         </w:tc>
         <w:tc>
           <w:tcPr>
-            <w:tcW w:type="dxa" w:w="4535"/>
-            <w:tcMar>
-              <w:top w:type="dxa" w:w="70"/>
-              <w:left w:type="dxa" w:w="120"/>
-              <w:bottom w:type="dxa" w:w="70"/>
-              <w:right w:type="dxa" w:w="120"/>
-            </w:tcMar>
-          </w:tcPr>
-          <w:p>
-            <w:pPr>
-              <w:spacing w:line="260"/>
-            </w:pPr>
-            <w:r>
-              <w:rPr>
-                <w:b w:val="false"/>
-                <w:bCs w:val="false"/>
-                <w:sz w:val="19"/>
-                <w:szCs w:val="19"/>
+            <w:tcW w:type="dxa" w:w="5623"/>
+            <w:tcMar>
+              <w:top w:type="dxa" w:w="110"/>
+              <w:left w:type="dxa" w:w="160"/>
+              <w:bottom w:type="dxa" w:w="110"/>
+              <w:right w:type="dxa" w:w="160"/>
+            </w:tcMar>
+            <w:vAlign w:val="center"/>
+          </w:tcPr>
+          <w:p>
+            <w:pPr>
+              <w:spacing w:line="300"/>
+            </w:pPr>
+            <w:r>
+              <w:rPr>
+                <w:b w:val="false"/>
+                <w:bCs w:val="false"/>
+                <w:sz w:val="24"/>
+                <w:szCs w:val="24"/>
               </w:rPr>
               <w:t xml:space="preserve"/>
             </w:r>
@@ -3357,26 +3422,30 @@
         </w:tc>
       </w:tr>
       <w:tr>
-        <w:tc>
-          <w:tcPr>
-            <w:tcW w:type="dxa" w:w="4535"/>
-            <w:tcMar>
-              <w:top w:type="dxa" w:w="70"/>
-              <w:left w:type="dxa" w:w="120"/>
-              <w:bottom w:type="dxa" w:w="70"/>
-              <w:right w:type="dxa" w:w="120"/>
-            </w:tcMar>
-          </w:tcPr>
-          <w:p>
-            <w:pPr>
-              <w:spacing w:line="260"/>
-            </w:pPr>
-            <w:r>
-              <w:rPr>
-                <w:b w:val="false"/>
-                <w:bCs w:val="false"/>
-                <w:sz w:val="19"/>
-                <w:szCs w:val="19"/>
+        <w:trPr>
+          <w:trHeight w:val="640" w:hRule="atLeast"/>
+        </w:trPr>
+        <w:tc>
+          <w:tcPr>
+            <w:tcW w:type="dxa" w:w="3447"/>
+            <w:tcMar>
+              <w:top w:type="dxa" w:w="110"/>
+              <w:left w:type="dxa" w:w="160"/>
+              <w:bottom w:type="dxa" w:w="110"/>
+              <w:right w:type="dxa" w:w="160"/>
+            </w:tcMar>
+            <w:vAlign w:val="center"/>
+          </w:tcPr>
+          <w:p>
+            <w:pPr>
+              <w:spacing w:line="300"/>
+            </w:pPr>
+            <w:r>
+              <w:rPr>
+                <w:b w:val="false"/>
+                <w:bCs w:val="false"/>
+                <w:sz w:val="24"/>
+                <w:szCs w:val="24"/>
               </w:rPr>
               <w:t xml:space="preserve">Today's date</w:t>
             </w:r>
@@ -3384,24 +3453,25 @@
         </w:tc>
         <w:tc>
           <w:tcPr>
-            <w:tcW w:type="dxa" w:w="4535"/>
-            <w:tcMar>
-              <w:top w:type="dxa" w:w="70"/>
-              <w:left w:type="dxa" w:w="120"/>
-              <w:bottom w:type="dxa" w:w="70"/>
-              <w:right w:type="dxa" w:w="120"/>
-            </w:tcMar>
-          </w:tcPr>
-          <w:p>
-            <w:pPr>
-              <w:spacing w:line="260"/>
-            </w:pPr>
-            <w:r>
-              <w:rPr>
-                <w:b w:val="false"/>
-                <w:bCs w:val="false"/>
-                <w:sz w:val="19"/>
-                <w:szCs w:val="19"/>
+            <w:tcW w:type="dxa" w:w="5623"/>
+            <w:tcMar>
+              <w:top w:type="dxa" w:w="110"/>
+              <w:left w:type="dxa" w:w="160"/>
+              <w:bottom w:type="dxa" w:w="110"/>
+              <w:right w:type="dxa" w:w="160"/>
+            </w:tcMar>
+            <w:vAlign w:val="center"/>
+          </w:tcPr>
+          <w:p>
+            <w:pPr>
+              <w:spacing w:line="300"/>
+            </w:pPr>
+            <w:r>
+              <w:rPr>
+                <w:b w:val="false"/>
+                <w:bCs w:val="false"/>
+                <w:sz w:val="24"/>
+                <w:szCs w:val="24"/>
               </w:rPr>
               <w:t xml:space="preserve"/>
             </w:r>
@@ -3409,6 +3479,18 @@
         </w:tc>
       </w:tr>
     </w:tbl>
+    <w:p>
+      <w:pPr>
+        <w:spacing w:after="180" w:before="0" w:line="300"/>
+      </w:pPr>
+      <w:r>
+        <w:rPr>
+          <w:sz w:val="22"/>
+          <w:szCs w:val="22"/>
+        </w:rPr>
+        <w:t xml:space="preserve"/>
+      </w:r>
+    </w:p>
     <w:p>
       <w:pPr>
         <w:pStyle w:val="Heading2"/>

</xml_diff>